<commit_message>
Use Case Tables and Diagrams
</commit_message>
<xml_diff>
--- a/Meeting-Reports/week5_meeting.docx
+++ b/Meeting-Reports/week5_meeting.docx
@@ -4,7 +4,7 @@
   <w:body>
     <w:p>
       <w:pPr>
-        <w:pStyle w:val="Body"/>
+        <w:pStyle w:val="Body A"/>
         <w:jc w:val="center"/>
         <w:rPr>
           <w:b w:val="1"/>
@@ -22,7 +22,7 @@
     </w:p>
     <w:p>
       <w:pPr>
-        <w:pStyle w:val="Body"/>
+        <w:pStyle w:val="Body A"/>
         <w:jc w:val="center"/>
         <w:rPr>
           <w:b w:val="1"/>
@@ -32,7 +32,7 @@
     </w:p>
     <w:p>
       <w:pPr>
-        <w:pStyle w:val="Body"/>
+        <w:pStyle w:val="Body A"/>
       </w:pPr>
       <w:r>
         <w:rPr>
@@ -53,12 +53,12 @@
     </w:p>
     <w:p>
       <w:pPr>
-        <w:pStyle w:val="Body"/>
-      </w:pPr>
-    </w:p>
-    <w:p>
-      <w:pPr>
-        <w:pStyle w:val="Body"/>
+        <w:pStyle w:val="Body A"/>
+      </w:pPr>
+    </w:p>
+    <w:p>
+      <w:pPr>
+        <w:pStyle w:val="Body A"/>
       </w:pPr>
       <w:r>
         <w:rPr>
@@ -91,12 +91,12 @@
     </w:p>
     <w:p>
       <w:pPr>
-        <w:pStyle w:val="Body"/>
-      </w:pPr>
-    </w:p>
-    <w:p>
-      <w:pPr>
-        <w:pStyle w:val="Body"/>
+        <w:pStyle w:val="Body A"/>
+      </w:pPr>
+    </w:p>
+    <w:p>
+      <w:pPr>
+        <w:pStyle w:val="Body A"/>
       </w:pPr>
       <w:r>
         <w:rPr>
@@ -116,12 +116,12 @@
     </w:p>
     <w:p>
       <w:pPr>
-        <w:pStyle w:val="Body"/>
-      </w:pPr>
-    </w:p>
-    <w:p>
-      <w:pPr>
-        <w:pStyle w:val="Body"/>
+        <w:pStyle w:val="Body A"/>
+      </w:pPr>
+    </w:p>
+    <w:p>
+      <w:pPr>
+        <w:pStyle w:val="Body A"/>
       </w:pPr>
       <w:r>
         <w:rPr>
@@ -141,12 +141,12 @@
     </w:p>
     <w:p>
       <w:pPr>
-        <w:pStyle w:val="Body"/>
-      </w:pPr>
-    </w:p>
-    <w:p>
-      <w:pPr>
-        <w:pStyle w:val="Body"/>
+        <w:pStyle w:val="Body A"/>
+      </w:pPr>
+    </w:p>
+    <w:p>
+      <w:pPr>
+        <w:pStyle w:val="Body A"/>
       </w:pPr>
       <w:r>
         <w:rPr>
@@ -166,12 +166,12 @@
     </w:p>
     <w:p>
       <w:pPr>
-        <w:pStyle w:val="Body"/>
-      </w:pPr>
-    </w:p>
-    <w:p>
-      <w:pPr>
-        <w:pStyle w:val="Body"/>
+        <w:pStyle w:val="Body A"/>
+      </w:pPr>
+    </w:p>
+    <w:p>
+      <w:pPr>
+        <w:pStyle w:val="Body A"/>
       </w:pPr>
       <w:r>
         <w:rPr>
@@ -191,12 +191,12 @@
     </w:p>
     <w:p>
       <w:pPr>
-        <w:pStyle w:val="Body"/>
-      </w:pPr>
-    </w:p>
-    <w:p>
-      <w:pPr>
-        <w:pStyle w:val="Body"/>
+        <w:pStyle w:val="Body A"/>
+      </w:pPr>
+    </w:p>
+    <w:p>
+      <w:pPr>
+        <w:pStyle w:val="Body A"/>
       </w:pPr>
       <w:r>
         <w:rPr>
@@ -216,12 +216,12 @@
     </w:p>
     <w:p>
       <w:pPr>
-        <w:pStyle w:val="Body"/>
-      </w:pPr>
-    </w:p>
-    <w:p>
-      <w:pPr>
-        <w:pStyle w:val="Body"/>
+        <w:pStyle w:val="Body A"/>
+      </w:pPr>
+    </w:p>
+    <w:p>
+      <w:pPr>
+        <w:pStyle w:val="Body A"/>
       </w:pPr>
       <w:r>
         <w:rPr>
@@ -242,7 +242,7 @@
     </w:p>
     <w:p>
       <w:pPr>
-        <w:pStyle w:val="Body"/>
+        <w:pStyle w:val="Body A"/>
       </w:pPr>
       <w:r>
         <w:rPr>
@@ -254,12 +254,12 @@
     </w:p>
     <w:p>
       <w:pPr>
-        <w:pStyle w:val="Body"/>
-      </w:pPr>
-    </w:p>
-    <w:p>
-      <w:pPr>
-        <w:pStyle w:val="Body"/>
+        <w:pStyle w:val="Body A"/>
+      </w:pPr>
+    </w:p>
+    <w:p>
+      <w:pPr>
+        <w:pStyle w:val="Body A"/>
       </w:pPr>
       <w:r>
         <w:rPr>
@@ -280,12 +280,12 @@
     </w:p>
     <w:p>
       <w:pPr>
-        <w:pStyle w:val="Body"/>
-      </w:pPr>
-    </w:p>
-    <w:p>
-      <w:pPr>
-        <w:pStyle w:val="Body"/>
+        <w:pStyle w:val="Body A"/>
+      </w:pPr>
+    </w:p>
+    <w:p>
+      <w:pPr>
+        <w:pStyle w:val="Body A"/>
         <w:rPr>
           <w:b w:val="1"/>
           <w:bCs w:val="1"/>
@@ -303,7 +303,7 @@
     </w:p>
     <w:p>
       <w:pPr>
-        <w:pStyle w:val="Body"/>
+        <w:pStyle w:val="Body A"/>
       </w:pPr>
       <w:r>
         <w:rPr>
@@ -347,12 +347,12 @@
     </w:p>
     <w:p>
       <w:pPr>
-        <w:pStyle w:val="Body"/>
-      </w:pPr>
-    </w:p>
-    <w:p>
-      <w:pPr>
-        <w:pStyle w:val="Body"/>
+        <w:pStyle w:val="Body A"/>
+      </w:pPr>
+    </w:p>
+    <w:p>
+      <w:pPr>
+        <w:pStyle w:val="Body A"/>
         <w:rPr>
           <w:b w:val="1"/>
           <w:bCs w:val="1"/>
@@ -370,7 +370,7 @@
     </w:p>
     <w:p>
       <w:pPr>
-        <w:pStyle w:val="Body"/>
+        <w:pStyle w:val="Body A"/>
       </w:pPr>
       <w:r>
         <w:rPr>
@@ -414,12 +414,12 @@
     </w:p>
     <w:p>
       <w:pPr>
-        <w:pStyle w:val="Body"/>
-      </w:pPr>
-    </w:p>
-    <w:p>
-      <w:pPr>
-        <w:pStyle w:val="Body"/>
+        <w:pStyle w:val="Body A"/>
+      </w:pPr>
+    </w:p>
+    <w:p>
+      <w:pPr>
+        <w:pStyle w:val="Body A"/>
         <w:rPr>
           <w:b w:val="1"/>
           <w:bCs w:val="1"/>
@@ -437,38 +437,29 @@
     </w:p>
     <w:p>
       <w:pPr>
-        <w:pStyle w:val="Body"/>
-        <w:rPr>
-          <w:b w:val="1"/>
-          <w:bCs w:val="1"/>
-        </w:rPr>
-      </w:pPr>
-    </w:p>
-    <w:p>
-      <w:pPr>
-        <w:pStyle w:val="Body"/>
-        <w:rPr>
-          <w:b w:val="1"/>
-          <w:bCs w:val="1"/>
-        </w:rPr>
-      </w:pPr>
-      <w:r>
-        <w:rPr>
-          <w:b w:val="1"/>
-          <w:bCs w:val="1"/>
-          <w:rtl w:val="0"/>
-          <w:lang w:val="en-US"/>
-        </w:rPr>
-        <w:t xml:space="preserve">Each member of the team must create the particular </w:t>
-      </w:r>
-      <w:r>
-        <w:rPr>
-          <w:b w:val="1"/>
-          <w:bCs w:val="1"/>
-          <w:rtl w:val="0"/>
-          <w:lang w:val="en-US"/>
-        </w:rPr>
-        <w:t>activity diagrams</w:t>
+        <w:pStyle w:val="Body A"/>
+        <w:rPr>
+          <w:b w:val="1"/>
+          <w:bCs w:val="1"/>
+        </w:rPr>
+      </w:pPr>
+    </w:p>
+    <w:p>
+      <w:pPr>
+        <w:pStyle w:val="Body A"/>
+        <w:rPr>
+          <w:b w:val="1"/>
+          <w:bCs w:val="1"/>
+        </w:rPr>
+      </w:pPr>
+      <w:r>
+        <w:rPr>
+          <w:b w:val="1"/>
+          <w:bCs w:val="1"/>
+          <w:rtl w:val="0"/>
+          <w:lang w:val="en-US"/>
+        </w:rPr>
+        <w:t>Each member of the team must create the particular activity diagrams</w:t>
       </w:r>
       <w:r>
         <w:rPr>
@@ -485,26 +476,17 @@
           <w:rtl w:val="0"/>
           <w:lang w:val="en-US"/>
         </w:rPr>
-        <w:t xml:space="preserve">and state diagrams for each use case table </w:t>
-      </w:r>
-      <w:r>
-        <w:rPr>
-          <w:b w:val="1"/>
-          <w:bCs w:val="1"/>
-          <w:rtl w:val="0"/>
-          <w:lang w:val="en-US"/>
-        </w:rPr>
-        <w:t xml:space="preserve">they have done. </w:t>
-      </w:r>
-    </w:p>
-    <w:p>
-      <w:pPr>
-        <w:pStyle w:val="Body"/>
-      </w:pPr>
-    </w:p>
-    <w:p>
-      <w:pPr>
-        <w:pStyle w:val="Body"/>
+        <w:t xml:space="preserve">and state diagrams for each use case table they have done. </w:t>
+      </w:r>
+    </w:p>
+    <w:p>
+      <w:pPr>
+        <w:pStyle w:val="Body A"/>
+      </w:pPr>
+    </w:p>
+    <w:p>
+      <w:pPr>
+        <w:pStyle w:val="Body A"/>
       </w:pPr>
       <w:r>
         <w:rPr>
@@ -516,13 +498,20 @@
     </w:p>
     <w:p>
       <w:pPr>
-        <w:pStyle w:val="Body"/>
-      </w:pPr>
-      <w:r>
-        <w:rPr>
-          <w:rtl w:val="0"/>
-        </w:rPr>
-        <w:t xml:space="preserve">19/03/2026 - Epoka University - </w:t>
+        <w:pStyle w:val="Body A"/>
+      </w:pPr>
+      <w:r>
+        <w:rPr>
+          <w:rtl w:val="0"/>
+          <w:lang w:val="en-US"/>
+        </w:rPr>
+        <w:t>26</w:t>
+      </w:r>
+      <w:r>
+        <w:rPr>
+          <w:rtl w:val="0"/>
+        </w:rPr>
+        <w:t xml:space="preserve">/03/2026 - Epoka University - </w:t>
       </w:r>
     </w:p>
     <w:sectPr>
@@ -717,9 +706,9 @@
       </w14:textFill>
     </w:rPr>
   </w:style>
-  <w:style w:type="paragraph" w:styleId="Body">
-    <w:name w:val="Body"/>
-    <w:next w:val="Body"/>
+  <w:style w:type="paragraph" w:styleId="Body A">
+    <w:name w:val="Body A"/>
+    <w:next w:val="Body A"/>
     <w:pPr>
       <w:keepNext w:val="0"/>
       <w:keepLines w:val="0"/>
@@ -753,8 +742,9 @@
       <w:u w:val="none" w:color="000000"/>
       <w:shd w:val="nil" w:color="auto" w:fill="auto"/>
       <w:vertAlign w:val="baseline"/>
-      <w14:textOutline>
+      <w14:textOutline w14:w="12700" w14:cap="flat">
         <w14:noFill/>
+        <w14:miter w14:lim="400000"/>
       </w14:textOutline>
       <w14:textFill>
         <w14:solidFill>
@@ -911,9 +901,9 @@
         </a:effectStyle>
         <a:effectStyle>
           <a:effectLst>
-            <a:outerShdw sx="100000" sy="100000" kx="0" ky="0" algn="b" rotWithShape="0" blurRad="38100" dist="20000" dir="5400000">
+            <a:outerShdw sx="100000" sy="100000" kx="0" ky="0" algn="b" rotWithShape="0" blurRad="38100" dist="23000" dir="5400000">
               <a:srgbClr val="000000">
-                <a:alpha val="38000"/>
+                <a:alpha val="35000"/>
               </a:srgbClr>
             </a:outerShdw>
           </a:effectLst>
@@ -993,7 +983,7 @@
         </a:effectLst>
         <a:sp3d/>
       </a:spPr>
-      <a:bodyPr rot="0" spcFirstLastPara="1" vertOverflow="overflow" horzOverflow="overflow" vert="horz" wrap="square" lIns="45719" tIns="45719" rIns="45719" bIns="45719" numCol="1" spcCol="38100" rtlCol="0" anchor="ctr" upright="0">
+      <a:bodyPr rot="0" spcFirstLastPara="1" vertOverflow="overflow" horzOverflow="overflow" vert="horz" wrap="square" lIns="45718" tIns="45718" rIns="45718" bIns="45718" numCol="1" spcCol="38100" rtlCol="0" anchor="ctr" upright="0">
         <a:spAutoFit/>
       </a:bodyPr>
       <a:lstStyle>
@@ -1021,10 +1011,10 @@
             </a:solidFill>
             <a:effectLst/>
             <a:uFillTx/>
-            <a:latin typeface="Cambria"/>
-            <a:ea typeface="Cambria"/>
-            <a:cs typeface="Cambria"/>
-            <a:sym typeface="Cambria"/>
+            <a:latin typeface="+mn-lt"/>
+            <a:ea typeface="+mn-ea"/>
+            <a:cs typeface="+mn-cs"/>
+            <a:sym typeface="Helvetica Neue"/>
           </a:defRPr>
         </a:defPPr>
         <a:lvl1pPr marL="0" marR="0" indent="0" algn="l" defTabSz="914400" rtl="0" fontAlgn="auto" latinLnBrk="1" hangingPunct="0">
@@ -1280,9 +1270,9 @@
           <a:round/>
         </a:ln>
         <a:effectLst>
-          <a:outerShdw sx="100000" sy="100000" kx="0" ky="0" algn="b" rotWithShape="0" blurRad="38100" dist="20000" dir="5400000">
+          <a:outerShdw sx="100000" sy="100000" kx="0" ky="0" algn="b" rotWithShape="0" blurRad="38100" dist="23000" dir="5400000">
             <a:srgbClr val="000000">
-              <a:alpha val="38000"/>
+              <a:alpha val="35000"/>
             </a:srgbClr>
           </a:outerShdw>
         </a:effectLst>
@@ -1570,7 +1560,7 @@
         <a:effectLst/>
         <a:sp3d/>
       </a:spPr>
-      <a:bodyPr rot="0" spcFirstLastPara="1" vertOverflow="overflow" horzOverflow="overflow" vert="horz" wrap="square" lIns="45719" tIns="45719" rIns="45719" bIns="45719" numCol="1" spcCol="38100" rtlCol="0" anchor="t" upright="0">
+      <a:bodyPr rot="0" spcFirstLastPara="1" vertOverflow="overflow" horzOverflow="overflow" vert="horz" wrap="square" lIns="45718" tIns="45718" rIns="45718" bIns="45718" numCol="1" spcCol="38100" rtlCol="0" anchor="t" upright="0">
         <a:spAutoFit/>
       </a:bodyPr>
       <a:lstStyle>
@@ -1598,10 +1588,10 @@
             </a:solidFill>
             <a:effectLst/>
             <a:uFillTx/>
-            <a:latin typeface="Cambria"/>
-            <a:ea typeface="Cambria"/>
-            <a:cs typeface="Cambria"/>
-            <a:sym typeface="Cambria"/>
+            <a:latin typeface="+mn-lt"/>
+            <a:ea typeface="+mn-ea"/>
+            <a:cs typeface="+mn-cs"/>
+            <a:sym typeface="Helvetica Neue"/>
           </a:defRPr>
         </a:defPPr>
         <a:lvl1pPr marL="0" marR="0" indent="0" algn="l" defTabSz="914400" rtl="0" fontAlgn="auto" latinLnBrk="1" hangingPunct="0">

</xml_diff>